<commit_message>
Tie each theoretical approach to the interview analysis in the seminar theory chapter
Co-Authored-By: Claude Fable 5.1 <noreply@anthropic.com>
Claude-Session: https://claude.ai/code/session_011Z9C2ptByc9jQga6MDruQz
</commit_message>
<xml_diff>
--- a/deliverables/עבודה_סמינריונית_גוף_תרבות_לבוש.docx
+++ b/deliverables/עבודה_סמינריונית_גוף_תרבות_לבוש.docx
@@ -1167,7 +1167,7 @@
           <w:szCs w:val="24"/>
           <w:rtl/>
         </w:rPr>
-        <w:t xml:space="preserve">	10</w:t>
+        <w:t xml:space="preserve">	11</w:t>
       </w:r>
     </w:p>
     <w:p>
@@ -1497,7 +1497,7 @@
           <w:szCs w:val="24"/>
           <w:rtl/>
         </w:rPr>
-        <w:t xml:space="preserve">	15</w:t>
+        <w:t xml:space="preserve">	16</w:t>
       </w:r>
     </w:p>
     <w:p>
@@ -4221,7 +4221,7 @@
           <w:szCs w:val="24"/>
           <w:rtl/>
         </w:rPr>
-        <w:t xml:space="preserve">העבודה נשענת על שלוש גישות תיאורטיות משלימות, שכל אחת מהן מסבירה היבט אחר של הקשר בין לבוש למעמד, ועל מודל בולטות המותג (Han et al., 2010), שמחבר ביניהן ומתרגם אותן לכלי ניתוח.</w:t>
+        <w:t xml:space="preserve">העבודה נשענת על שלוש גישות תיאורטיות משלימות, שכל אחת מהן מסבירה היבט אחר של הקשר בין לבוש למעמד, ועל מודל בולטות המותג (Han et al., 2010), שמחבר ביניהן ומתרגם אותן לכלי ניתוח. לכל גישה שני תפקידים בעבודה: היא מכוונת את קריאת התמונות, והיא מספקת את המונחים שבהם נקראות תשובות המרואיינות.</w:t>
       </w:r>
     </w:p>
     <w:p>
@@ -4279,7 +4279,7 @@
           <w:szCs w:val="24"/>
           <w:rtl/>
         </w:rPr>
-        <w:t xml:space="preserve">הגישה מסייעת לפענח את תמונות היוקרה הבולטת: היא מכוונת את הניתוח לסימנים הגלויים ולמספרם, ומסבירה מדוע לוגו גדול נקרא כהצהרה על עושר. לפי מרזל (2005), המודל אינו מתאר נכון את שדה האופנה, ולכן נדרשות גישות נוספות.</w:t>
+        <w:t xml:space="preserve">הגישה מסייעת לפענח את תמונות היוקרה הבולטת: היא מכוונת את הניתוח לסימנים הגלויים ולמספרם, ומסבירה מדוע לוגו גדול נקרא כהצהרה על עושר. בראיונות היא עומדת מאחורי השאלה מי "מנסה להיראות עשיר", ומאפשרת לבדוק אם הצופות אכן קוראות את הסימן הגלוי כאות לעושר, או כמשהו אחר. לפי מרזל (2005), המודל אינו מתאר נכון את שדה האופנה, ולכן נדרשות גישות נוספות.</w:t>
       </w:r>
     </w:p>
     <w:p>
@@ -4337,7 +4337,7 @@
           <w:szCs w:val="24"/>
           <w:rtl/>
         </w:rPr>
-        <w:t xml:space="preserve">מודל החלחול מסביר את המעבר מיוקרה רועשת לשקטה: כשהלוגו נעשה נגיש, ואף זמין בזיופים (Romani et al., 2012; Wilcox et al., 2009), הוא מאבד מכוחו המבדיל. הביקורת על המודל מסייעת לפענח את תמונה 1, שבה פריט רחוב נמכר כמוצר יוקרה.</w:t>
+        <w:t xml:space="preserve">מודל החלחול מסביר את המעבר מיוקרה רועשת לשקטה: כשהלוגו נעשה נגיש, ואף זמין בזיופים (Romani et al., 2012; Wilcox et al., 2009), הוא מאבד מכוחו המבדיל. הביקורת על המודל מסייעת לפענח את תמונה 1, שבה פריט רחוב נמכר כמוצר יוקרה. בראיונות המודל משמש לקריאת שלב הגילוי: כשהמרואיינות לומדות שהפריטים השקטים יקרים כמו הרועשים, הן מתארות בעצמן את המנגנון שבו סמל שהתפשט מוחלף בסמל שקשה לחקות.</w:t>
       </w:r>
     </w:p>
     <w:p>
@@ -4395,7 +4395,7 @@
           <w:szCs w:val="24"/>
           <w:rtl/>
         </w:rPr>
-        <w:t xml:space="preserve">גישה זו מסייעת לפענח את תמונות היוקרה השקטה: היא מסבירה מדוע חומר, גזרה ופרטים קטנים נושאים מסר מעמדי, ומדוע המסר נקרא רק בידי מי שמכיר את הקוד.</w:t>
+        <w:t xml:space="preserve">גישה זו מסייעת לפענח את תמונות היוקרה השקטה: היא מסבירה מדוע חומר, גזרה ופרטים קטנים נושאים מסר מעמדי, ומדוע המסר נקרא רק בידי מי שמכיר את הקוד. היא גם הסיבה לכך שהמרואיינות נבחרו ברמות שונות של ידע באופנה: אם המעמד ניכר בידע לקרוא ולשלב, צופות עם ידע שונה אמורות לקרוא את אותה תמונה אחרת, וההשוואה ביניהן בודקת את הטענה.</w:t>
       </w:r>
     </w:p>
     <w:p>
@@ -4435,7 +4435,7 @@
           <w:szCs w:val="24"/>
           <w:rtl/>
         </w:rPr>
-        <w:t xml:space="preserve">מודל בולטות המותג (Han et al., 2010) מבחין בין אותות רועשים, שפונים לקהל רחב ומבטאים את ההיגיון של הצריכה הראוותנית, לבין אותות שקטים, שפונים לבני קבוצה מצומצמת ומבטאים את ההיגיון של ההון התרבותי. בעבודה זו המודל קבע את חלוקת התמונות לשתי קבוצות, ויחד עם שלוש הגישות קבע את קטגוריות הניתוח: בולטות המותג נגזרה מהצריכה הראוותנית, המקור הסגנוני והחריגה מקוד הלבוש ממודל החלחול, והחומר, הגזרה והפרטים מגישת ההון התרבותי. השילוב נבחר משום שרק כך אפשר לפענח את התמונות הרועשות והשקטות באותה מסגרת.</w:t>
+        <w:t xml:space="preserve">מודל בולטות המותג (Han et al., 2010) מבחין בין אותות רועשים, שפונים לקהל רחב ומבטאים את ההיגיון של הצריכה הראוותנית, לבין אותות שקטים, שפונים לבני קבוצה מצומצמת ומבטאים את ההיגיון של ההון התרבותי. בעבודה זו המודל קבע את חלוקת התמונות לשתי קבוצות, ויחד עם שלוש הגישות קבע את קטגוריות הניתוח: בולטות המותג נגזרה מהצריכה הראוותנית, המקור הסגנוני והחריגה מקוד הלבוש ממודל החלחול, והחומר, הגזרה והפרטים מגישת ההון התרבותי. השילוב נבחר משום שרק כך אפשר לפענח את התמונות הרועשות והשקטות באותה מסגרת. גם שאלות הראיון נגזרו מהמודל: השאלות על תיאור האדם, עיסוקו ומעמדו בודקות את הקריאה הספונטנית של האות, שאלת הדירוג והמאמץ בודקת את ההבחנה בין רועש לשקט, ושלב הגילוי בודק מה קורה לקריאה כשהצופה מקבלת את המידע על המותג ועל המחיר.</w:t>
       </w:r>
     </w:p>
     <w:p>

</xml_diff>

<commit_message>
Use black headings in the seminar
Co-Authored-By: Claude Fable 5.1 <noreply@anthropic.com>
Claude-Session: https://claude.ai/code/session_011Z9C2ptByc9jQga6MDruQz
</commit_message>
<xml_diff>
--- a/deliverables/עבודה_סמינריונית_גוף_תרבות_לבוש.docx
+++ b/deliverables/עבודה_סמינריונית_גוף_תרבות_לבוש.docx
@@ -1728,7 +1728,7 @@
           <w:bCs/>
           <w:i w:val="false"/>
           <w:iCs w:val="false"/>
-          <w:color w:val="2E74B5"/>
+          <w:color w:val="000000"/>
           <w:sz w:val="24"/>
           <w:szCs w:val="24"/>
           <w:rtl/>
@@ -1787,7 +1787,7 @@
           <w:bCs/>
           <w:i w:val="false"/>
           <w:iCs w:val="false"/>
-          <w:color w:val="2E74B5"/>
+          <w:color w:val="000000"/>
           <w:sz w:val="24"/>
           <w:szCs w:val="24"/>
           <w:rtl/>
@@ -1954,7 +1954,7 @@
           <w:bCs/>
           <w:i w:val="false"/>
           <w:iCs w:val="false"/>
-          <w:color w:val="2E74B5"/>
+          <w:color w:val="000000"/>
           <w:sz w:val="24"/>
           <w:szCs w:val="24"/>
           <w:rtl/>
@@ -1977,7 +1977,7 @@
           <w:bCs/>
           <w:i w:val="false"/>
           <w:iCs w:val="false"/>
-          <w:color w:val="2E74B5"/>
+          <w:color w:val="000000"/>
           <w:sz w:val="24"/>
           <w:szCs w:val="24"/>
           <w:rtl/>
@@ -2036,7 +2036,7 @@
           <w:bCs/>
           <w:i w:val="false"/>
           <w:iCs w:val="false"/>
-          <w:color w:val="2E74B5"/>
+          <w:color w:val="000000"/>
           <w:sz w:val="24"/>
           <w:szCs w:val="24"/>
           <w:rtl/>
@@ -2077,7 +2077,7 @@
           <w:bCs/>
           <w:i w:val="false"/>
           <w:iCs w:val="false"/>
-          <w:color w:val="2E74B5"/>
+          <w:color w:val="000000"/>
           <w:sz w:val="24"/>
           <w:szCs w:val="24"/>
           <w:rtl/>
@@ -2190,7 +2190,7 @@
           <w:bCs/>
           <w:i w:val="false"/>
           <w:iCs w:val="false"/>
-          <w:color w:val="2E74B5"/>
+          <w:color w:val="000000"/>
           <w:sz w:val="24"/>
           <w:szCs w:val="24"/>
           <w:rtl/>
@@ -2249,7 +2249,7 @@
           <w:bCs/>
           <w:i w:val="false"/>
           <w:iCs w:val="false"/>
-          <w:color w:val="2E74B5"/>
+          <w:color w:val="000000"/>
           <w:sz w:val="24"/>
           <w:szCs w:val="24"/>
           <w:rtl/>
@@ -2308,7 +2308,7 @@
           <w:bCs/>
           <w:i w:val="false"/>
           <w:iCs w:val="false"/>
-          <w:color w:val="2E74B5"/>
+          <w:color w:val="000000"/>
           <w:sz w:val="24"/>
           <w:szCs w:val="24"/>
           <w:rtl/>
@@ -2331,7 +2331,7 @@
           <w:bCs/>
           <w:i w:val="false"/>
           <w:iCs w:val="false"/>
-          <w:color w:val="2E74B5"/>
+          <w:color w:val="000000"/>
           <w:sz w:val="24"/>
           <w:szCs w:val="24"/>
           <w:rtl/>
@@ -2372,7 +2372,7 @@
           <w:bCs/>
           <w:i w:val="false"/>
           <w:iCs w:val="false"/>
-          <w:color w:val="2E74B5"/>
+          <w:color w:val="000000"/>
           <w:sz w:val="24"/>
           <w:szCs w:val="24"/>
           <w:rtl/>
@@ -2431,7 +2431,7 @@
           <w:bCs/>
           <w:i w:val="false"/>
           <w:iCs w:val="false"/>
-          <w:color w:val="2E74B5"/>
+          <w:color w:val="000000"/>
           <w:sz w:val="24"/>
           <w:szCs w:val="24"/>
           <w:rtl/>
@@ -2472,7 +2472,7 @@
           <w:bCs/>
           <w:i w:val="false"/>
           <w:iCs w:val="false"/>
-          <w:color w:val="2E74B5"/>
+          <w:color w:val="000000"/>
           <w:sz w:val="24"/>
           <w:szCs w:val="24"/>
           <w:rtl/>
@@ -4113,7 +4113,7 @@
           <w:bCs/>
           <w:i w:val="false"/>
           <w:iCs w:val="false"/>
-          <w:color w:val="2E74B5"/>
+          <w:color w:val="000000"/>
           <w:sz w:val="24"/>
           <w:szCs w:val="24"/>
           <w:rtl/>
@@ -4154,7 +4154,7 @@
           <w:bCs/>
           <w:i w:val="false"/>
           <w:iCs w:val="false"/>
-          <w:color w:val="2E74B5"/>
+          <w:color w:val="000000"/>
           <w:sz w:val="24"/>
           <w:szCs w:val="24"/>
           <w:rtl/>
@@ -4195,7 +4195,7 @@
           <w:bCs/>
           <w:i w:val="false"/>
           <w:iCs w:val="false"/>
-          <w:color w:val="2E74B5"/>
+          <w:color w:val="000000"/>
           <w:sz w:val="24"/>
           <w:szCs w:val="24"/>
           <w:rtl/>
@@ -4236,7 +4236,7 @@
           <w:bCs/>
           <w:i w:val="false"/>
           <w:iCs w:val="false"/>
-          <w:color w:val="2E74B5"/>
+          <w:color w:val="000000"/>
           <w:sz w:val="24"/>
           <w:szCs w:val="24"/>
           <w:rtl/>
@@ -4295,7 +4295,7 @@
           <w:bCs/>
           <w:i w:val="false"/>
           <w:iCs w:val="false"/>
-          <w:color w:val="2E74B5"/>
+          <w:color w:val="000000"/>
           <w:sz w:val="24"/>
           <w:szCs w:val="24"/>
           <w:rtl/>
@@ -4354,7 +4354,7 @@
           <w:bCs/>
           <w:i w:val="false"/>
           <w:iCs w:val="false"/>
-          <w:color w:val="2E74B5"/>
+          <w:color w:val="000000"/>
           <w:sz w:val="24"/>
           <w:szCs w:val="24"/>
           <w:rtl/>
@@ -4413,7 +4413,7 @@
           <w:bCs/>
           <w:i w:val="false"/>
           <w:iCs w:val="false"/>
-          <w:color w:val="2E74B5"/>
+          <w:color w:val="000000"/>
           <w:sz w:val="24"/>
           <w:szCs w:val="24"/>
           <w:rtl/>
@@ -4454,7 +4454,7 @@
           <w:bCs/>
           <w:i w:val="false"/>
           <w:iCs w:val="false"/>
-          <w:color w:val="2E74B5"/>
+          <w:color w:val="000000"/>
           <w:sz w:val="24"/>
           <w:szCs w:val="24"/>
           <w:rtl/>
@@ -4495,7 +4495,7 @@
           <w:bCs/>
           <w:i w:val="false"/>
           <w:iCs w:val="false"/>
-          <w:color w:val="2E74B5"/>
+          <w:color w:val="000000"/>
           <w:sz w:val="24"/>
           <w:szCs w:val="24"/>
           <w:rtl/>
@@ -5384,7 +5384,7 @@
           <w:bCs/>
           <w:i w:val="false"/>
           <w:iCs w:val="false"/>
-          <w:color w:val="2E74B5"/>
+          <w:color w:val="000000"/>
           <w:sz w:val="24"/>
           <w:szCs w:val="24"/>
           <w:rtl/>
@@ -5407,7 +5407,7 @@
           <w:bCs/>
           <w:i/>
           <w:iCs/>
-          <w:color w:val="1F4D78"/>
+          <w:color w:val="000000"/>
           <w:sz w:val="24"/>
           <w:szCs w:val="24"/>
           <w:rtl/>
@@ -5596,7 +5596,7 @@
           <w:bCs/>
           <w:i/>
           <w:iCs/>
-          <w:color w:val="1F4D78"/>
+          <w:color w:val="000000"/>
           <w:sz w:val="24"/>
           <w:szCs w:val="24"/>
           <w:rtl/>
@@ -5921,7 +5921,7 @@
           <w:bCs/>
           <w:i/>
           <w:iCs/>
-          <w:color w:val="1F4D78"/>
+          <w:color w:val="000000"/>
           <w:sz w:val="24"/>
           <w:szCs w:val="24"/>
           <w:rtl/>
@@ -6110,7 +6110,7 @@
           <w:bCs/>
           <w:i w:val="false"/>
           <w:iCs w:val="false"/>
-          <w:color w:val="2E74B5"/>
+          <w:color w:val="000000"/>
           <w:sz w:val="24"/>
           <w:szCs w:val="24"/>
           <w:rtl/>
@@ -7540,7 +7540,7 @@
           <w:bCs/>
           <w:i w:val="false"/>
           <w:iCs w:val="false"/>
-          <w:color w:val="2E74B5"/>
+          <w:color w:val="000000"/>
           <w:sz w:val="24"/>
           <w:szCs w:val="24"/>
           <w:rtl/>
@@ -7563,7 +7563,7 @@
           <w:bCs/>
           <w:i/>
           <w:iCs/>
-          <w:color w:val="1F4D78"/>
+          <w:color w:val="000000"/>
           <w:sz w:val="24"/>
           <w:szCs w:val="24"/>
           <w:rtl/>
@@ -7622,7 +7622,7 @@
           <w:bCs/>
           <w:i/>
           <w:iCs/>
-          <w:color w:val="1F4D78"/>
+          <w:color w:val="000000"/>
           <w:sz w:val="24"/>
           <w:szCs w:val="24"/>
           <w:rtl/>
@@ -7663,7 +7663,7 @@
           <w:bCs/>
           <w:i/>
           <w:iCs/>
-          <w:color w:val="1F4D78"/>
+          <w:color w:val="000000"/>
           <w:sz w:val="24"/>
           <w:szCs w:val="24"/>
           <w:rtl/>
@@ -7722,7 +7722,7 @@
           <w:bCs/>
           <w:i/>
           <w:iCs/>
-          <w:color w:val="1F4D78"/>
+          <w:color w:val="000000"/>
           <w:sz w:val="24"/>
           <w:szCs w:val="24"/>
           <w:rtl/>
@@ -7781,7 +7781,7 @@
           <w:bCs/>
           <w:i/>
           <w:iCs/>
-          <w:color w:val="1F4D78"/>
+          <w:color w:val="000000"/>
           <w:sz w:val="24"/>
           <w:szCs w:val="24"/>
           <w:rtl/>
@@ -7840,7 +7840,7 @@
           <w:bCs/>
           <w:i/>
           <w:iCs/>
-          <w:color w:val="1F4D78"/>
+          <w:color w:val="000000"/>
           <w:sz w:val="24"/>
           <w:szCs w:val="24"/>
           <w:rtl/>
@@ -7899,7 +7899,7 @@
           <w:bCs/>
           <w:i w:val="false"/>
           <w:iCs w:val="false"/>
-          <w:color w:val="2E74B5"/>
+          <w:color w:val="000000"/>
           <w:sz w:val="24"/>
           <w:szCs w:val="24"/>
           <w:rtl/>
@@ -7989,7 +7989,7 @@
           <w:bCs/>
           <w:i w:val="false"/>
           <w:iCs w:val="false"/>
-          <w:color w:val="2E74B5"/>
+          <w:color w:val="000000"/>
           <w:sz w:val="24"/>
           <w:szCs w:val="24"/>
           <w:rtl/>
@@ -8956,7 +8956,7 @@
           <w:bCs/>
           <w:i w:val="false"/>
           <w:iCs w:val="false"/>
-          <w:color w:val="2E74B5"/>
+          <w:color w:val="000000"/>
           <w:sz w:val="24"/>
           <w:szCs w:val="24"/>
           <w:rtl/>
@@ -8979,7 +8979,7 @@
           <w:bCs/>
           <w:i w:val="false"/>
           <w:iCs w:val="false"/>
-          <w:color w:val="2E74B5"/>
+          <w:color w:val="000000"/>
           <w:sz w:val="24"/>
           <w:szCs w:val="24"/>
           <w:rtl/>
@@ -9439,7 +9439,7 @@
           <w:bCs/>
           <w:i w:val="false"/>
           <w:iCs w:val="false"/>
-          <w:color w:val="2E74B5"/>
+          <w:color w:val="000000"/>
           <w:sz w:val="24"/>
           <w:szCs w:val="24"/>
           <w:rtl/>
@@ -9481,7 +9481,7 @@
           <w:bCs/>
           <w:i/>
           <w:iCs/>
-          <w:color w:val="1F4D78"/>
+          <w:color w:val="000000"/>
           <w:sz w:val="24"/>
           <w:szCs w:val="24"/>
           <w:rtl/>
@@ -11395,7 +11395,7 @@
           <w:bCs/>
           <w:i/>
           <w:iCs/>
-          <w:color w:val="1F4D78"/>
+          <w:color w:val="000000"/>
           <w:sz w:val="24"/>
           <w:szCs w:val="24"/>
           <w:rtl/>
@@ -13367,7 +13367,7 @@
           <w:bCs/>
           <w:i/>
           <w:iCs/>
-          <w:color w:val="1F4D78"/>
+          <w:color w:val="000000"/>
           <w:sz w:val="24"/>
           <w:szCs w:val="24"/>
           <w:rtl/>
@@ -15339,7 +15339,7 @@
           <w:bCs/>
           <w:i/>
           <w:iCs/>
-          <w:color w:val="1F4D78"/>
+          <w:color w:val="000000"/>
           <w:sz w:val="24"/>
           <w:szCs w:val="24"/>
           <w:rtl/>
@@ -17195,7 +17195,7 @@
           <w:bCs/>
           <w:i/>
           <w:iCs/>
-          <w:color w:val="1F4D78"/>
+          <w:color w:val="000000"/>
           <w:sz w:val="24"/>
           <w:szCs w:val="24"/>
           <w:rtl/>
@@ -19109,7 +19109,7 @@
           <w:bCs/>
           <w:i/>
           <w:iCs/>
-          <w:color w:val="1F4D78"/>
+          <w:color w:val="000000"/>
           <w:sz w:val="24"/>
           <w:szCs w:val="24"/>
           <w:rtl/>
@@ -20906,7 +20906,7 @@
           <w:bCs/>
           <w:i w:val="false"/>
           <w:iCs w:val="false"/>
-          <w:color w:val="2E74B5"/>
+          <w:color w:val="000000"/>
           <w:sz w:val="24"/>
           <w:szCs w:val="24"/>
           <w:rtl/>
@@ -25051,7 +25051,7 @@
           <w:bCs/>
           <w:i w:val="false"/>
           <w:iCs w:val="false"/>
-          <w:color w:val="2E74B5"/>
+          <w:color w:val="000000"/>
           <w:sz w:val="24"/>
           <w:szCs w:val="24"/>
           <w:rtl/>
@@ -25092,7 +25092,7 @@
           <w:bCs/>
           <w:i w:val="false"/>
           <w:iCs w:val="false"/>
-          <w:color w:val="2E74B5"/>
+          <w:color w:val="000000"/>
           <w:sz w:val="24"/>
           <w:szCs w:val="24"/>
           <w:rtl/>
@@ -25527,7 +25527,7 @@
       <w:bCs/>
       <w:i w:val="false"/>
       <w:iCs w:val="false"/>
-      <w:color w:val="2E74B5"/>
+      <w:color w:val="000000"/>
       <w:sz w:val="24"/>
       <w:szCs w:val="24"/>
     </w:rPr>
@@ -25549,7 +25549,7 @@
       <w:bCs/>
       <w:i w:val="false"/>
       <w:iCs w:val="false"/>
-      <w:color w:val="2E74B5"/>
+      <w:color w:val="000000"/>
       <w:sz w:val="24"/>
       <w:szCs w:val="24"/>
     </w:rPr>
@@ -25571,7 +25571,7 @@
       <w:bCs/>
       <w:i/>
       <w:iCs/>
-      <w:color w:val="1F4D78"/>
+      <w:color w:val="000000"/>
       <w:sz w:val="24"/>
       <w:szCs w:val="24"/>
     </w:rPr>

</xml_diff>

<commit_message>
Align seminar chapter names with course guideline order
Co-Authored-By: Claude Fable 5.1 <noreply@anthropic.com>
Claude-Session: https://claude.ai/code/session_011Z9C2ptByc9jQga6MDruQz
</commit_message>
<xml_diff>
--- a/deliverables/עבודה_סמינריונית_גוף_תרבות_לבוש.docx
+++ b/deliverables/עבודה_סמינריונית_גוף_תרבות_לבוש.docx
@@ -635,7 +635,7 @@
               <w:szCs w:val="24"/>
               <w:rtl/>
             </w:rPr>
-            <w:t xml:space="preserve">שיטת המחקר</w:t>
+            <w:t xml:space="preserve">מתודולוגיה</w:t>
           </w:r>
           <w:r>
             <w:rPr>
@@ -1019,7 +1019,7 @@
               <w:szCs w:val="24"/>
               <w:rtl/>
             </w:rPr>
-            <w:t xml:space="preserve">ניתוח</w:t>
+            <w:t xml:space="preserve">חלק הניתוח</w:t>
           </w:r>
           <w:r>
             <w:rPr>
@@ -1936,7 +1936,7 @@
           <w:szCs w:val="24"/>
           <w:rtl/>
         </w:rPr>
-        <w:t xml:space="preserve">אחרי המבוא מוצגות סקירת הספרות, שיטת המחקר והתיאוריה, ולאחריהן פרק הניתוח, שמשלב את הניתוח החזותי עם ממצאי הראיונות, והסיכום. שאלות הראיון מופיעות בנספח א', ותמלילי הראיונות המלאים בנספח ב'.</w:t>
+        <w:t xml:space="preserve">אחרי המבוא מוצגות סקירת הספרות, המתודולוגיה והתיאוריה, ולאחריהן חלק הניתוח, שמשלב את הניתוח החזותי עם ממצאי הראיונות, והסיכום. שאלות הראיון מופיעות בנספח א', ותמלילי הראיונות המלאים בנספח ב'.</w:t>
       </w:r>
     </w:p>
     <w:p>
@@ -2313,7 +2313,7 @@
           <w:szCs w:val="24"/>
           <w:rtl/>
         </w:rPr>
-        <w:t xml:space="preserve">שיטת המחקר</w:t>
+        <w:t xml:space="preserve">מתודולוגיה</w:t>
       </w:r>
     </w:p>
     <w:p>
@@ -4459,7 +4459,7 @@
           <w:szCs w:val="24"/>
           <w:rtl/>
         </w:rPr>
-        <w:t xml:space="preserve">ניתוח</w:t>
+        <w:t xml:space="preserve">חלק הניתוח</w:t>
       </w:r>
     </w:p>
     <w:p>
@@ -20929,7 +20929,7 @@
           <w:szCs w:val="24"/>
           <w:rtl/>
         </w:rPr>
-        <w:t xml:space="preserve">טבלאות הקידוד שלהלן מסכמות את הניתוח של כל תמונה לפי קטגוריות הניתוח שתוארו בפרק שיטת המחקר. בעמודה הימנית מופיע מה שנראה בתמונה, ובעמודה השמאלית הפרשנות.</w:t>
+        <w:t xml:space="preserve">טבלאות הקידוד שלהלן מסכמות את הניתוח של כל תמונה לפי קטגוריות הניתוח שתוארו בפרק המתודולוגיה. בעמודה הימנית מופיע מה שנראה בתמונה, ובעמודה השמאלית הפרשנות.</w:t>
       </w:r>
     </w:p>
     <w:p>

</xml_diff>

<commit_message>
Add university logo to seminar cover page
Co-Authored-By: Claude Fable 5.1 <noreply@anthropic.com>
Claude-Session: https://claude.ai/code/session_011Z9C2ptByc9jQga6MDruQz
</commit_message>
<xml_diff>
--- a/deliverables/עבודה_סמינריונית_גוף_תרבות_לבוש.docx
+++ b/deliverables/עבודה_סמינריונית_גוף_תרבות_לבוש.docx
@@ -4,21 +4,48 @@
   <w:body>
     <w:p>
       <w:pPr>
-        <w:bidi/>
-        <w:spacing w:after="0" w:before="0" w:line="360" w:lineRule="auto"/>
+        <w:spacing w:after="120" w:before="0" w:line="240" w:lineRule="auto"/>
         <w:jc w:val="center"/>
       </w:pPr>
       <w:r>
-        <w:rPr>
-          <w:noProof/>
-          <w:rFonts w:ascii="Times New Roman" w:cs="David" w:eastAsia="David" w:hAnsi="Times New Roman"/>
-          <w:b w:val="false"/>
-          <w:bCs w:val="false"/>
-          <w:sz w:val="24"/>
-          <w:szCs w:val="24"/>
-          <w:rtl/>
-        </w:rPr>
-        <w:t xml:space="preserve">[סמל אוניברסיטת חיפה]</w:t>
+        <w:drawing>
+          <wp:inline distT="0" distB="0" distL="0" distR="0">
+            <wp:extent cx="2095500" cy="1257300"/>
+            <wp:effectExtent t="0" r="0" b="0" l="0"/>
+            <wp:docPr id="1" name="" descr="" title=""/>
+            <wp:cNvGraphicFramePr>
+              <a:graphicFrameLocks xmlns:a="http://schemas.openxmlformats.org/drawingml/2006/main" noChangeAspect="1"/>
+            </wp:cNvGraphicFramePr>
+            <a:graphic xmlns:a="http://schemas.openxmlformats.org/drawingml/2006/main">
+              <a:graphicData uri="http://schemas.openxmlformats.org/drawingml/2006/picture">
+                <pic:pic xmlns:pic="http://schemas.openxmlformats.org/drawingml/2006/picture">
+                  <pic:nvPicPr>
+                    <pic:cNvPr id="0" name="" descr=""/>
+                    <pic:cNvPicPr>
+                      <a:picLocks noChangeAspect="1" noChangeArrowheads="1"/>
+                    </pic:cNvPicPr>
+                  </pic:nvPicPr>
+                  <pic:blipFill>
+                    <a:blip r:embed="rId8" cstate="none"/>
+                    <a:srcRect/>
+                    <a:stretch>
+                      <a:fillRect/>
+                    </a:stretch>
+                  </pic:blipFill>
+                  <pic:spPr bwMode="auto">
+                    <a:xfrm>
+                      <a:off x="0" y="0"/>
+                      <a:ext cx="2095500" cy="1257300"/>
+                    </a:xfrm>
+                    <a:prstGeom prst="rect">
+                      <a:avLst/>
+                    </a:prstGeom>
+                  </pic:spPr>
+                </pic:pic>
+              </a:graphicData>
+            </a:graphic>
+          </wp:inline>
+        </w:drawing>
       </w:r>
     </w:p>
     <w:p>
@@ -5480,7 +5507,7 @@
                     </pic:cNvPicPr>
                   </pic:nvPicPr>
                   <pic:blipFill>
-                    <a:blip r:embed="rId8" cstate="none"/>
+                    <a:blip r:embed="rId9" cstate="none"/>
                     <a:srcRect/>
                     <a:stretch>
                       <a:fillRect/>
@@ -5654,142 +5681,6 @@
         <w:drawing>
           <wp:inline distT="0" distB="0" distL="0" distR="0">
             <wp:extent cx="1428750" cy="1905000"/>
-            <wp:effectExtent t="0" r="0" b="0" l="0"/>
-            <wp:docPr id="1" name="" descr="" title=""/>
-            <wp:cNvGraphicFramePr>
-              <a:graphicFrameLocks xmlns:a="http://schemas.openxmlformats.org/drawingml/2006/main" noChangeAspect="1"/>
-            </wp:cNvGraphicFramePr>
-            <a:graphic xmlns:a="http://schemas.openxmlformats.org/drawingml/2006/main">
-              <a:graphicData uri="http://schemas.openxmlformats.org/drawingml/2006/picture">
-                <pic:pic xmlns:pic="http://schemas.openxmlformats.org/drawingml/2006/picture">
-                  <pic:nvPicPr>
-                    <pic:cNvPr id="0" name="" descr=""/>
-                    <pic:cNvPicPr>
-                      <a:picLocks noChangeAspect="1" noChangeArrowheads="1"/>
-                    </pic:cNvPicPr>
-                  </pic:nvPicPr>
-                  <pic:blipFill>
-                    <a:blip r:embed="rId9" cstate="none"/>
-                    <a:srcRect/>
-                    <a:stretch>
-                      <a:fillRect/>
-                    </a:stretch>
-                  </pic:blipFill>
-                  <pic:spPr bwMode="auto">
-                    <a:xfrm>
-                      <a:off x="0" y="0"/>
-                      <a:ext cx="1428750" cy="1905000"/>
-                    </a:xfrm>
-                    <a:prstGeom prst="rect">
-                      <a:avLst/>
-                    </a:prstGeom>
-                  </pic:spPr>
-                </pic:pic>
-              </a:graphicData>
-            </a:graphic>
-          </wp:inline>
-        </w:drawing>
-      </w:r>
-    </w:p>
-    <w:p>
-      <w:pPr>
-        <w:bidi/>
-        <w:spacing w:after="0" w:before="0" w:line="360" w:lineRule="auto"/>
-        <w:jc w:val="right"/>
-      </w:pPr>
-      <w:r>
-        <w:rPr>
-          <w:noProof/>
-          <w:rFonts w:ascii="Times New Roman" w:cs="David" w:eastAsia="David" w:hAnsi="Times New Roman"/>
-          <w:i/>
-          <w:iCs/>
-          <w:sz w:val="22"/>
-          <w:szCs w:val="22"/>
-          <w:rtl/>
-        </w:rPr>
-        <w:t xml:space="preserve">הערה. מתוך: אתר NET-A-PORTER, 2026.</w:t>
-      </w:r>
-    </w:p>
-    <w:p>
-      <w:pPr>
-        <w:bidi/>
-        <w:spacing w:after="0" w:before="0" w:line="360" w:lineRule="auto"/>
-        <w:ind/>
-        <w:jc w:val="both"/>
-      </w:pPr>
-      <w:r>
-        <w:rPr>
-          <w:noProof/>
-          <w:rFonts w:ascii="Times New Roman" w:cs="David" w:eastAsia="David" w:hAnsi="Times New Roman"/>
-          <w:b/>
-          <w:bCs/>
-          <w:sz w:val="24"/>
-          <w:szCs w:val="24"/>
-          <w:rtl/>
-        </w:rPr>
-        <w:t xml:space="preserve">תיאור תמונה 2:</w:t>
-      </w:r>
-      <w:r>
-        <w:rPr>
-          <w:noProof/>
-          <w:rFonts w:ascii="Times New Roman" w:cs="David" w:eastAsia="David" w:hAnsi="Times New Roman"/>
-          <w:sz w:val="24"/>
-          <w:szCs w:val="24"/>
-          <w:rtl/>
-        </w:rPr>
-        <w:t xml:space="preserve"> דוגמנית פוסעת על רקע ספסל בטון וקיר אפור. היא לובשת מעיל קאמל ארוך ופתוח מעל סוודר סרוג באותו גוון, חצאית קצרה ומגפי זמש חומים. על צווארה צעיף בהיר עם הדפס חוזר של מונוגרמת Loewe, ובידה תיק עור שחור של Stella McCartney ששם המותג מחורר לאורכו.</w:t>
-      </w:r>
-    </w:p>
-    <w:p>
-      <w:pPr>
-        <w:keepNext/>
-        <w:bidi/>
-        <w:spacing w:after="0" w:before="0" w:line="360" w:lineRule="auto"/>
-        <w:jc w:val="right"/>
-      </w:pPr>
-      <w:r>
-        <w:rPr>
-          <w:noProof/>
-          <w:rFonts w:ascii="Times New Roman" w:cs="David" w:eastAsia="David" w:hAnsi="Times New Roman"/>
-          <w:b/>
-          <w:bCs/>
-          <w:sz w:val="24"/>
-          <w:szCs w:val="24"/>
-          <w:rtl/>
-        </w:rPr>
-        <w:t xml:space="preserve">איור 3</w:t>
-      </w:r>
-    </w:p>
-    <w:p>
-      <w:pPr>
-        <w:keepNext/>
-        <w:bidi/>
-        <w:spacing w:after="0" w:before="0" w:line="360" w:lineRule="auto"/>
-        <w:jc w:val="right"/>
-      </w:pPr>
-      <w:r>
-        <w:rPr>
-          <w:noProof/>
-          <w:rFonts w:ascii="Times New Roman" w:cs="David" w:eastAsia="David" w:hAnsi="Times New Roman"/>
-          <w:i/>
-          <w:iCs/>
-          <w:sz w:val="24"/>
-          <w:szCs w:val="24"/>
-          <w:rtl/>
-        </w:rPr>
-        <w:t xml:space="preserve">מעיל Manuela של Max Mara, סגור בחגורה</w:t>
-      </w:r>
-    </w:p>
-    <w:p>
-      <w:pPr>
-        <w:keepNext/>
-        <w:spacing w:after="0" w:before="0" w:line="240" w:lineRule="auto"/>
-        <w:jc w:val="center"/>
-      </w:pPr>
-      <w:r>
-        <w:drawing>
-          <wp:inline distT="0" distB="0" distL="0" distR="0">
-            <wp:extent cx="1143000" cy="1905000"/>
             <wp:effectExtent t="0" r="0" b="0" l="0"/>
             <wp:docPr id="1" name="" descr="" title=""/>
             <wp:cNvGraphicFramePr>
@@ -5814,6 +5705,142 @@
                   <pic:spPr bwMode="auto">
                     <a:xfrm>
                       <a:off x="0" y="0"/>
+                      <a:ext cx="1428750" cy="1905000"/>
+                    </a:xfrm>
+                    <a:prstGeom prst="rect">
+                      <a:avLst/>
+                    </a:prstGeom>
+                  </pic:spPr>
+                </pic:pic>
+              </a:graphicData>
+            </a:graphic>
+          </wp:inline>
+        </w:drawing>
+      </w:r>
+    </w:p>
+    <w:p>
+      <w:pPr>
+        <w:bidi/>
+        <w:spacing w:after="0" w:before="0" w:line="360" w:lineRule="auto"/>
+        <w:jc w:val="right"/>
+      </w:pPr>
+      <w:r>
+        <w:rPr>
+          <w:noProof/>
+          <w:rFonts w:ascii="Times New Roman" w:cs="David" w:eastAsia="David" w:hAnsi="Times New Roman"/>
+          <w:i/>
+          <w:iCs/>
+          <w:sz w:val="22"/>
+          <w:szCs w:val="22"/>
+          <w:rtl/>
+        </w:rPr>
+        <w:t xml:space="preserve">הערה. מתוך: אתר NET-A-PORTER, 2026.</w:t>
+      </w:r>
+    </w:p>
+    <w:p>
+      <w:pPr>
+        <w:bidi/>
+        <w:spacing w:after="0" w:before="0" w:line="360" w:lineRule="auto"/>
+        <w:ind/>
+        <w:jc w:val="both"/>
+      </w:pPr>
+      <w:r>
+        <w:rPr>
+          <w:noProof/>
+          <w:rFonts w:ascii="Times New Roman" w:cs="David" w:eastAsia="David" w:hAnsi="Times New Roman"/>
+          <w:b/>
+          <w:bCs/>
+          <w:sz w:val="24"/>
+          <w:szCs w:val="24"/>
+          <w:rtl/>
+        </w:rPr>
+        <w:t xml:space="preserve">תיאור תמונה 2:</w:t>
+      </w:r>
+      <w:r>
+        <w:rPr>
+          <w:noProof/>
+          <w:rFonts w:ascii="Times New Roman" w:cs="David" w:eastAsia="David" w:hAnsi="Times New Roman"/>
+          <w:sz w:val="24"/>
+          <w:szCs w:val="24"/>
+          <w:rtl/>
+        </w:rPr>
+        <w:t xml:space="preserve"> דוגמנית פוסעת על רקע ספסל בטון וקיר אפור. היא לובשת מעיל קאמל ארוך ופתוח מעל סוודר סרוג באותו גוון, חצאית קצרה ומגפי זמש חומים. על צווארה צעיף בהיר עם הדפס חוזר של מונוגרמת Loewe, ובידה תיק עור שחור של Stella McCartney ששם המותג מחורר לאורכו.</w:t>
+      </w:r>
+    </w:p>
+    <w:p>
+      <w:pPr>
+        <w:keepNext/>
+        <w:bidi/>
+        <w:spacing w:after="0" w:before="0" w:line="360" w:lineRule="auto"/>
+        <w:jc w:val="right"/>
+      </w:pPr>
+      <w:r>
+        <w:rPr>
+          <w:noProof/>
+          <w:rFonts w:ascii="Times New Roman" w:cs="David" w:eastAsia="David" w:hAnsi="Times New Roman"/>
+          <w:b/>
+          <w:bCs/>
+          <w:sz w:val="24"/>
+          <w:szCs w:val="24"/>
+          <w:rtl/>
+        </w:rPr>
+        <w:t xml:space="preserve">איור 3</w:t>
+      </w:r>
+    </w:p>
+    <w:p>
+      <w:pPr>
+        <w:keepNext/>
+        <w:bidi/>
+        <w:spacing w:after="0" w:before="0" w:line="360" w:lineRule="auto"/>
+        <w:jc w:val="right"/>
+      </w:pPr>
+      <w:r>
+        <w:rPr>
+          <w:noProof/>
+          <w:rFonts w:ascii="Times New Roman" w:cs="David" w:eastAsia="David" w:hAnsi="Times New Roman"/>
+          <w:i/>
+          <w:iCs/>
+          <w:sz w:val="24"/>
+          <w:szCs w:val="24"/>
+          <w:rtl/>
+        </w:rPr>
+        <w:t xml:space="preserve">מעיל Manuela של Max Mara, סגור בחגורה</w:t>
+      </w:r>
+    </w:p>
+    <w:p>
+      <w:pPr>
+        <w:keepNext/>
+        <w:spacing w:after="0" w:before="0" w:line="240" w:lineRule="auto"/>
+        <w:jc w:val="center"/>
+      </w:pPr>
+      <w:r>
+        <w:drawing>
+          <wp:inline distT="0" distB="0" distL="0" distR="0">
+            <wp:extent cx="1143000" cy="1905000"/>
+            <wp:effectExtent t="0" r="0" b="0" l="0"/>
+            <wp:docPr id="1" name="" descr="" title=""/>
+            <wp:cNvGraphicFramePr>
+              <a:graphicFrameLocks xmlns:a="http://schemas.openxmlformats.org/drawingml/2006/main" noChangeAspect="1"/>
+            </wp:cNvGraphicFramePr>
+            <a:graphic xmlns:a="http://schemas.openxmlformats.org/drawingml/2006/main">
+              <a:graphicData uri="http://schemas.openxmlformats.org/drawingml/2006/picture">
+                <pic:pic xmlns:pic="http://schemas.openxmlformats.org/drawingml/2006/picture">
+                  <pic:nvPicPr>
+                    <pic:cNvPr id="0" name="" descr=""/>
+                    <pic:cNvPicPr>
+                      <a:picLocks noChangeAspect="1" noChangeArrowheads="1"/>
+                    </pic:cNvPicPr>
+                  </pic:nvPicPr>
+                  <pic:blipFill>
+                    <a:blip r:embed="rId11" cstate="none"/>
+                    <a:srcRect/>
+                    <a:stretch>
+                      <a:fillRect/>
+                    </a:stretch>
+                  </pic:blipFill>
+                  <pic:spPr bwMode="auto">
+                    <a:xfrm>
+                      <a:off x="0" y="0"/>
                       <a:ext cx="1143000" cy="1905000"/>
                     </a:xfrm>
                     <a:prstGeom prst="rect">
@@ -5994,7 +6021,7 @@
                     </pic:cNvPicPr>
                   </pic:nvPicPr>
                   <pic:blipFill>
-                    <a:blip r:embed="rId11" cstate="none"/>
+                    <a:blip r:embed="rId12" cstate="none"/>
                     <a:srcRect/>
                     <a:stretch>
                       <a:fillRect/>

</xml_diff>

<commit_message>
Use unique image ids in seminar document
Co-Authored-By: Claude Fable 5.1 <noreply@anthropic.com>
Claude-Session: https://claude.ai/code/session_011Z9C2ptByc9jQga6MDruQz
</commit_message>
<xml_diff>
--- a/deliverables/עבודה_סמינריונית_גוף_תרבות_לבוש.docx
+++ b/deliverables/עבודה_סמינריונית_גוף_תרבות_לבוש.docx
@@ -5493,7 +5493,7 @@
           <wp:inline distT="0" distB="0" distL="0" distR="0">
             <wp:extent cx="952500" cy="1905000"/>
             <wp:effectExtent t="0" r="0" b="0" l="0"/>
-            <wp:docPr id="1" name="" descr="" title=""/>
+            <wp:docPr id="2" name="" descr="" title=""/>
             <wp:cNvGraphicFramePr>
               <a:graphicFrameLocks xmlns:a="http://schemas.openxmlformats.org/drawingml/2006/main" noChangeAspect="1"/>
             </wp:cNvGraphicFramePr>
@@ -5682,7 +5682,7 @@
           <wp:inline distT="0" distB="0" distL="0" distR="0">
             <wp:extent cx="1428750" cy="1905000"/>
             <wp:effectExtent t="0" r="0" b="0" l="0"/>
-            <wp:docPr id="1" name="" descr="" title=""/>
+            <wp:docPr id="3" name="" descr="" title=""/>
             <wp:cNvGraphicFramePr>
               <a:graphicFrameLocks xmlns:a="http://schemas.openxmlformats.org/drawingml/2006/main" noChangeAspect="1"/>
             </wp:cNvGraphicFramePr>
@@ -5818,7 +5818,7 @@
           <wp:inline distT="0" distB="0" distL="0" distR="0">
             <wp:extent cx="1143000" cy="1905000"/>
             <wp:effectExtent t="0" r="0" b="0" l="0"/>
-            <wp:docPr id="1" name="" descr="" title=""/>
+            <wp:docPr id="4" name="" descr="" title=""/>
             <wp:cNvGraphicFramePr>
               <a:graphicFrameLocks xmlns:a="http://schemas.openxmlformats.org/drawingml/2006/main" noChangeAspect="1"/>
             </wp:cNvGraphicFramePr>
@@ -6007,7 +6007,7 @@
           <wp:inline distT="0" distB="0" distL="0" distR="0">
             <wp:extent cx="1323975" cy="1905000"/>
             <wp:effectExtent t="0" r="0" b="0" l="0"/>
-            <wp:docPr id="1" name="" descr="" title=""/>
+            <wp:docPr id="5" name="" descr="" title=""/>
             <wp:cNvGraphicFramePr>
               <a:graphicFrameLocks xmlns:a="http://schemas.openxmlformats.org/drawingml/2006/main" noChangeAspect="1"/>
             </wp:cNvGraphicFramePr>

</xml_diff>